<commit_message>
Align reports with real form responses
</commit_message>
<xml_diff>
--- a/Психологический_центр_готово/01_Лабораторная_1_Сетевое_анкетирование/Лабораторная1_Отчет_сетевое_анкетирование.docx
+++ b/Психологический_центр_готово/01_Лабораторная_1_Сетевое_анкетирование/Лабораторная1_Отчет_сетевое_анкетирование.docx
@@ -3194,7 +3194,7 @@
           </w:tcPr>
           <w:p>
             <w:r>
-              <w:t>Возраст</w:t>
+              <w:t>Отметка времени</w:t>
             </w:r>
           </w:p>
         </w:tc>
@@ -3206,7 +3206,7 @@
           </w:tcPr>
           <w:p>
             <w:r>
-              <w:t>Пол</w:t>
+              <w:t>Баллы</w:t>
             </w:r>
           </w:p>
         </w:tc>
@@ -3218,7 +3218,7 @@
           </w:tcPr>
           <w:p>
             <w:r>
-              <w:t>Баллы</w:t>
+              <w:t>Контроль</w:t>
             </w:r>
           </w:p>
         </w:tc>
@@ -3230,7 +3230,7 @@
           </w:tcPr>
           <w:p>
             <w:r>
-              <w:t>Ложь</w:t>
+              <w:t>Интерпретация</w:t>
             </w:r>
           </w:p>
         </w:tc>
@@ -3242,7 +3242,7 @@
           </w:tcPr>
           <w:p>
             <w:r>
-              <w:t>Интерпретация</w:t>
+              <w:t>Примечание</w:t>
             </w:r>
           </w:p>
         </w:tc>
@@ -3266,7 +3266,7 @@
           </w:tcPr>
           <w:p>
             <w:r>
-              <w:t>19</w:t>
+              <w:t>07.05.2026 00:55</w:t>
             </w:r>
           </w:p>
         </w:tc>
@@ -3277,7 +3277,7 @@
           </w:tcPr>
           <w:p>
             <w:r>
-              <w:t>женский</w:t>
+              <w:t>18</w:t>
             </w:r>
           </w:p>
         </w:tc>
@@ -3288,7 +3288,7 @@
           </w:tcPr>
           <w:p>
             <w:r>
-              <w:t>50</w:t>
+              <w:t>2</w:t>
             </w:r>
           </w:p>
         </w:tc>
@@ -3299,7 +3299,7 @@
           </w:tcPr>
           <w:p>
             <w:r>
-              <w:t>2</w:t>
+              <w:t>средний уровень тревоги с тенденцией к высокому</w:t>
             </w:r>
           </w:p>
         </w:tc>
@@ -3310,7 +3310,7 @@
           </w:tcPr>
           <w:p>
             <w:r>
-              <w:t>очень высокий уровень тревоги</w:t>
+              <w:t>результат принят</w:t>
             </w:r>
           </w:p>
         </w:tc>
@@ -3334,7 +3334,7 @@
           </w:tcPr>
           <w:p>
             <w:r>
-              <w:t>22</w:t>
+              <w:t>07.05.2026 02:31</w:t>
             </w:r>
           </w:p>
         </w:tc>
@@ -3345,7 +3345,7 @@
           </w:tcPr>
           <w:p>
             <w:r>
-              <w:t>мужской</w:t>
+              <w:t>31</w:t>
             </w:r>
           </w:p>
         </w:tc>
@@ -3356,7 +3356,7 @@
           </w:tcPr>
           <w:p>
             <w:r>
-              <w:t>26</w:t>
+              <w:t>4</w:t>
             </w:r>
           </w:p>
         </w:tc>
@@ -3367,7 +3367,7 @@
           </w:tcPr>
           <w:p>
             <w:r>
-              <w:t>0</w:t>
+              <w:t>высокий уровень тревоги</w:t>
             </w:r>
           </w:p>
         </w:tc>
@@ -3378,7 +3378,7 @@
           </w:tcPr>
           <w:p>
             <w:r>
-              <w:t>высокий уровень тревоги</w:t>
+              <w:t>результат принят</w:t>
             </w:r>
           </w:p>
         </w:tc>
@@ -3402,7 +3402,7 @@
           </w:tcPr>
           <w:p>
             <w:r>
-              <w:t>20</w:t>
+              <w:t>07.05.2026 02:39</w:t>
             </w:r>
           </w:p>
         </w:tc>
@@ -3413,7 +3413,7 @@
           </w:tcPr>
           <w:p>
             <w:r>
-              <w:t>женский</w:t>
+              <w:t>29</w:t>
             </w:r>
           </w:p>
         </w:tc>
@@ -3424,7 +3424,7 @@
           </w:tcPr>
           <w:p>
             <w:r>
-              <w:t>7</w:t>
+              <w:t>6</w:t>
             </w:r>
           </w:p>
         </w:tc>
@@ -3435,7 +3435,7 @@
           </w:tcPr>
           <w:p>
             <w:r>
-              <w:t>2</w:t>
+              <w:t>высокий уровень тревоги</w:t>
             </w:r>
           </w:p>
         </w:tc>
@@ -3446,7 +3446,7 @@
           </w:tcPr>
           <w:p>
             <w:r>
-              <w:t>средний уровень тревоги с тенденцией к низкому</w:t>
+              <w:t>результат может быть недостоверным</w:t>
             </w:r>
           </w:p>
         </w:tc>
@@ -4195,7 +4195,7 @@
           </w:tcPr>
           <w:p>
             <w:r>
-              <w:t>19</w:t>
+              <w:t>18</w:t>
             </w:r>
           </w:p>
         </w:tc>
@@ -4217,7 +4217,7 @@
           </w:tcPr>
           <w:p>
             <w:r>
-              <w:t>4 из 5</w:t>
+              <w:t>3 из 5</w:t>
             </w:r>
           </w:p>
         </w:tc>
@@ -4228,7 +4228,7 @@
           </w:tcPr>
           <w:p>
             <w:r>
-              <w:t>возможно</w:t>
+              <w:t>да</w:t>
             </w:r>
           </w:p>
         </w:tc>
@@ -4252,7 +4252,7 @@
           </w:tcPr>
           <w:p>
             <w:r>
-              <w:t>22</w:t>
+              <w:t>18</w:t>
             </w:r>
           </w:p>
         </w:tc>
@@ -4274,7 +4274,7 @@
           </w:tcPr>
           <w:p>
             <w:r>
-              <w:t>3 из 5</w:t>
+              <w:t>4 из 5</w:t>
             </w:r>
           </w:p>
         </w:tc>
@@ -4309,6 +4309,61 @@
           </w:tcPr>
           <w:p>
             <w:r>
+              <w:t>19</w:t>
+            </w:r>
+          </w:p>
+        </w:tc>
+        <w:tc>
+          <w:tcPr>
+            <w:tcW w:type="dxa" w:w="2051"/>
+            <w:vAlign w:val="center"/>
+          </w:tcPr>
+          <w:p>
+            <w:r>
+              <w:t>женский</w:t>
+            </w:r>
+          </w:p>
+        </w:tc>
+        <w:tc>
+          <w:tcPr>
+            <w:tcW w:type="dxa" w:w="2051"/>
+            <w:vAlign w:val="center"/>
+          </w:tcPr>
+          <w:p>
+            <w:r>
+              <w:t>2 из 5</w:t>
+            </w:r>
+          </w:p>
+        </w:tc>
+        <w:tc>
+          <w:tcPr>
+            <w:tcW w:type="dxa" w:w="2051"/>
+            <w:vAlign w:val="center"/>
+          </w:tcPr>
+          <w:p>
+            <w:r>
+              <w:t>возможно</w:t>
+            </w:r>
+          </w:p>
+        </w:tc>
+      </w:tr>
+      <w:tr>
+        <w:tc>
+          <w:tcPr>
+            <w:tcW w:type="dxa" w:w="2051"/>
+          </w:tcPr>
+          <w:p>
+            <w:r>
+              <w:t>Респондент 4</w:t>
+            </w:r>
+          </w:p>
+        </w:tc>
+        <w:tc>
+          <w:tcPr>
+            <w:tcW w:type="dxa" w:w="2051"/>
+          </w:tcPr>
+          <w:p>
+            <w:r>
               <w:t>20</w:t>
             </w:r>
           </w:p>
@@ -4316,33 +4371,30 @@
         <w:tc>
           <w:tcPr>
             <w:tcW w:type="dxa" w:w="2051"/>
-            <w:vAlign w:val="center"/>
-          </w:tcPr>
-          <w:p>
-            <w:r>
-              <w:t>женский</w:t>
+          </w:tcPr>
+          <w:p>
+            <w:r>
+              <w:t>предпочитаю не указывать</w:t>
             </w:r>
           </w:p>
         </w:tc>
         <w:tc>
           <w:tcPr>
             <w:tcW w:type="dxa" w:w="2051"/>
-            <w:vAlign w:val="center"/>
-          </w:tcPr>
-          <w:p>
-            <w:r>
-              <w:t>5 из 5</w:t>
+          </w:tcPr>
+          <w:p>
+            <w:r>
+              <w:t>2 из 5</w:t>
             </w:r>
           </w:p>
         </w:tc>
         <w:tc>
           <w:tcPr>
             <w:tcW w:type="dxa" w:w="2051"/>
-            <w:vAlign w:val="center"/>
-          </w:tcPr>
-          <w:p>
-            <w:r>
-              <w:t>нет</w:t>
+          </w:tcPr>
+          <w:p>
+            <w:r>
+              <w:t>да</w:t>
             </w:r>
           </w:p>
         </w:tc>
@@ -4363,7 +4415,7 @@
     </w:p>
     <w:p>
       <w:r>
-        <w:t>Сетевые анкеты подготовлены для публикации в Google Forms. Формы опубликованы, получены реальные ответы и экспортированы таблицы результатов в формате XLSX.</w:t>
+        <w:t>Сетевые анкеты созданы и опубликованы в Google Forms. Получены реальные ответы: 4 ответа по собственной анкете и 3 ответа по тесту тревожности; результаты экспортированы и обработаны в формате XLSX.</w:t>
       </w:r>
     </w:p>
     <w:p>

</xml_diff>